<commit_message>
Add the Power and Air Pressure Requirements document
Section VII clause 3.2.6.1.3 asks for a dedicated document on the
personalization unit's power and air pressure requirements. It gives
the datasheet's power figures, 100 to 240 VAC at 50/60 Hz and 2,500 W
per machine, and states that the laser-only machines need no compressed
air, so no pressure, flow rate or compressor applies.

The Change Management Plan loses Section 7.3, which held only a
placeholder for past implementation references, and its row in the
criteria table. Its commitments are now made by the Proposer and the
Supplier, as in the other documents, rather than by Inkript.

Co-Authored-By: Claude Opus 5.5 <noreply@anthropic.com>
Claude-Session: https://claude.ai/code/session_01G5KtDfxnVyqdZUVCaXFbWe
</commit_message>
<xml_diff>
--- a/Change-Management-Plan.docx
+++ b/Change-Management-Plan.docx
@@ -472,25 +472,6 @@
               <w:t xml:space="default">7.2 Requirements compliance matrix</w:t>
               <w:tab/>
               <w:t xml:space="default">15</w:t>
-            </w:r>
-          </w:hyperlink>
-        </w:p>
-        <w:p>
-          <w:pPr>
-            <w:pStyle w:val="TOC2"/>
-            <w:tabs>
-              <w:tab w:val="clear" w:pos="8786"/>
-              <w:tab w:val="right" w:pos="9025" w:leader="dot"/>
-            </w:tabs>
-          </w:pPr>
-          <w:hyperlink w:history="1" w:anchor="sec_7_3">
-            <w:r>
-              <w:rPr>
-                <w:rStyle w:val="IndexLink"/>
-              </w:rPr>
-              <w:t xml:space="default">7.3 Evidence of past implementation</w:t>
-              <w:tab/>
-              <w:t xml:space="default">16</w:t>
             </w:r>
           </w:hyperlink>
           <w:r>
@@ -865,9 +846,9 @@
         </w:tblBorders>
       </w:tblPr>
       <w:tblGrid>
-        <w:gridCol w:w="2074"/>
-        <w:gridCol w:w="4643"/>
-        <w:gridCol w:w="2303"/>
+        <w:gridCol w:w="2198"/>
+        <w:gridCol w:w="4523"/>
+        <w:gridCol w:w="2299"/>
       </w:tblGrid>
       <w:tr>
         <w:trPr>
@@ -875,7 +856,7 @@
         </w:trPr>
         <w:tc>
           <w:tcPr>
-            <w:tcW w:type="dxa" w:w="2074"/>
+            <w:tcW w:type="dxa" w:w="2198"/>
             <w:shd w:fill="EDEDED" w:val="clear"/>
             <w:tcMar>
               <w:top w:type="dxa" w:w="60"/>
@@ -901,7 +882,7 @@
         </w:tc>
         <w:tc>
           <w:tcPr>
-            <w:tcW w:type="dxa" w:w="4643"/>
+            <w:tcW w:type="dxa" w:w="4523"/>
             <w:shd w:fill="EDEDED" w:val="clear"/>
             <w:tcMar>
               <w:top w:type="dxa" w:w="60"/>
@@ -927,7 +908,7 @@
         </w:tc>
         <w:tc>
           <w:tcPr>
-            <w:tcW w:type="dxa" w:w="2303"/>
+            <w:tcW w:type="dxa" w:w="2299"/>
             <w:shd w:fill="EDEDED" w:val="clear"/>
             <w:tcMar>
               <w:top w:type="dxa" w:w="60"/>
@@ -955,7 +936,7 @@
       <w:tr>
         <w:tc>
           <w:tcPr>
-            <w:tcW w:type="dxa" w:w="2074"/>
+            <w:tcW w:type="dxa" w:w="2198"/>
             <w:tcMar>
               <w:top w:type="dxa" w:w="60"/>
               <w:left w:type="dxa" w:w="100"/>
@@ -980,7 +961,7 @@
         </w:tc>
         <w:tc>
           <w:tcPr>
-            <w:tcW w:type="dxa" w:w="4643"/>
+            <w:tcW w:type="dxa" w:w="4523"/>
             <w:tcMar>
               <w:top w:type="dxa" w:w="60"/>
               <w:left w:type="dxa" w:w="100"/>
@@ -1005,7 +986,7 @@
         </w:tc>
         <w:tc>
           <w:tcPr>
-            <w:tcW w:type="dxa" w:w="2303"/>
+            <w:tcW w:type="dxa" w:w="2299"/>
             <w:tcMar>
               <w:top w:type="dxa" w:w="60"/>
               <w:left w:type="dxa" w:w="100"/>
@@ -1051,7 +1032,7 @@
       <w:tr>
         <w:tc>
           <w:tcPr>
-            <w:tcW w:type="dxa" w:w="2074"/>
+            <w:tcW w:type="dxa" w:w="2198"/>
             <w:tcMar>
               <w:top w:type="dxa" w:w="60"/>
               <w:left w:type="dxa" w:w="100"/>
@@ -1076,7 +1057,7 @@
         </w:tc>
         <w:tc>
           <w:tcPr>
-            <w:tcW w:type="dxa" w:w="4643"/>
+            <w:tcW w:type="dxa" w:w="4523"/>
             <w:tcMar>
               <w:top w:type="dxa" w:w="60"/>
               <w:left w:type="dxa" w:w="100"/>
@@ -1101,7 +1082,7 @@
         </w:tc>
         <w:tc>
           <w:tcPr>
-            <w:tcW w:type="dxa" w:w="2303"/>
+            <w:tcW w:type="dxa" w:w="2299"/>
             <w:tcMar>
               <w:top w:type="dxa" w:w="60"/>
               <w:left w:type="dxa" w:w="100"/>
@@ -1147,7 +1128,7 @@
       <w:tr>
         <w:tc>
           <w:tcPr>
-            <w:tcW w:type="dxa" w:w="2074"/>
+            <w:tcW w:type="dxa" w:w="2198"/>
             <w:tcMar>
               <w:top w:type="dxa" w:w="60"/>
               <w:left w:type="dxa" w:w="100"/>
@@ -1172,7 +1153,7 @@
         </w:tc>
         <w:tc>
           <w:tcPr>
-            <w:tcW w:type="dxa" w:w="4643"/>
+            <w:tcW w:type="dxa" w:w="4523"/>
             <w:tcMar>
               <w:top w:type="dxa" w:w="60"/>
               <w:left w:type="dxa" w:w="100"/>
@@ -1197,7 +1178,7 @@
         </w:tc>
         <w:tc>
           <w:tcPr>
-            <w:tcW w:type="dxa" w:w="2303"/>
+            <w:tcW w:type="dxa" w:w="2299"/>
             <w:tcMar>
               <w:top w:type="dxa" w:w="60"/>
               <w:left w:type="dxa" w:w="100"/>
@@ -1243,7 +1224,7 @@
       <w:tr>
         <w:tc>
           <w:tcPr>
-            <w:tcW w:type="dxa" w:w="2074"/>
+            <w:tcW w:type="dxa" w:w="2198"/>
             <w:tcMar>
               <w:top w:type="dxa" w:w="60"/>
               <w:left w:type="dxa" w:w="100"/>
@@ -1268,7 +1249,7 @@
         </w:tc>
         <w:tc>
           <w:tcPr>
-            <w:tcW w:type="dxa" w:w="4643"/>
+            <w:tcW w:type="dxa" w:w="4523"/>
             <w:tcMar>
               <w:top w:type="dxa" w:w="60"/>
               <w:left w:type="dxa" w:w="100"/>
@@ -1293,7 +1274,7 @@
         </w:tc>
         <w:tc>
           <w:tcPr>
-            <w:tcW w:type="dxa" w:w="2303"/>
+            <w:tcW w:type="dxa" w:w="2299"/>
             <w:tcMar>
               <w:top w:type="dxa" w:w="60"/>
               <w:left w:type="dxa" w:w="100"/>
@@ -1339,7 +1320,7 @@
       <w:tr>
         <w:tc>
           <w:tcPr>
-            <w:tcW w:type="dxa" w:w="2074"/>
+            <w:tcW w:type="dxa" w:w="2198"/>
             <w:tcMar>
               <w:top w:type="dxa" w:w="60"/>
               <w:left w:type="dxa" w:w="100"/>
@@ -1364,7 +1345,7 @@
         </w:tc>
         <w:tc>
           <w:tcPr>
-            <w:tcW w:type="dxa" w:w="4643"/>
+            <w:tcW w:type="dxa" w:w="4523"/>
             <w:tcMar>
               <w:top w:type="dxa" w:w="60"/>
               <w:left w:type="dxa" w:w="100"/>
@@ -1389,7 +1370,7 @@
         </w:tc>
         <w:tc>
           <w:tcPr>
-            <w:tcW w:type="dxa" w:w="2303"/>
+            <w:tcW w:type="dxa" w:w="2299"/>
             <w:tcMar>
               <w:top w:type="dxa" w:w="60"/>
               <w:left w:type="dxa" w:w="100"/>
@@ -1421,89 +1402,7 @@
       <w:tr>
         <w:tc>
           <w:tcPr>
-            <w:tcW w:type="dxa" w:w="2074"/>
-            <w:tcMar>
-              <w:top w:type="dxa" w:w="60"/>
-              <w:left w:type="dxa" w:w="100"/>
-              <w:bottom w:type="dxa" w:w="60"/>
-              <w:right w:type="dxa" w:w="100"/>
-            </w:tcMar>
-          </w:tcPr>
-          <w:p>
-            <w:pPr>
-              <w:spacing w:after="0" w:before="0"/>
-            </w:pPr>
-            <w:r>
-              <w:rPr>
-                <w:b w:val="false"/>
-                <w:bCs w:val="false"/>
-                <w:i w:val="false"/>
-                <w:iCs w:val="false"/>
-              </w:rPr>
-              <w:t xml:space="preserve"/>
-            </w:r>
-          </w:p>
-        </w:tc>
-        <w:tc>
-          <w:tcPr>
-            <w:tcW w:type="dxa" w:w="4643"/>
-            <w:tcMar>
-              <w:top w:type="dxa" w:w="60"/>
-              <w:left w:type="dxa" w:w="100"/>
-              <w:bottom w:type="dxa" w:w="60"/>
-              <w:right w:type="dxa" w:w="100"/>
-            </w:tcMar>
-          </w:tcPr>
-          <w:p>
-            <w:pPr>
-              <w:spacing w:after="0" w:before="0"/>
-            </w:pPr>
-            <w:r>
-              <w:rPr>
-                <w:b w:val="false"/>
-                <w:bCs w:val="false"/>
-                <w:i w:val="false"/>
-                <w:iCs w:val="false"/>
-              </w:rPr>
-              <w:t xml:space="preserve">Evidence of past implementation</w:t>
-            </w:r>
-          </w:p>
-        </w:tc>
-        <w:tc>
-          <w:tcPr>
-            <w:tcW w:type="dxa" w:w="2303"/>
-            <w:tcMar>
-              <w:top w:type="dxa" w:w="60"/>
-              <w:left w:type="dxa" w:w="100"/>
-              <w:bottom w:type="dxa" w:w="60"/>
-              <w:right w:type="dxa" w:w="100"/>
-            </w:tcMar>
-          </w:tcPr>
-          <w:p>
-            <w:pPr>
-              <w:spacing w:after="0" w:before="0"/>
-            </w:pPr>
-            <w:r>
-              <w:rPr>
-                <w:b w:val="false"/>
-                <w:bCs w:val="false"/>
-                <w:i w:val="false"/>
-                <w:iCs w:val="false"/>
-              </w:rPr>
-              <w:t xml:space="preserve">Section </w:t>
-            </w:r>
-            <w:fldSimple w:instr="REF sec_7_3 \w \h">
-              <w:r>
-                <w:t xml:space="preserve">7.3</w:t>
-              </w:r>
-            </w:fldSimple>
-          </w:p>
-        </w:tc>
-      </w:tr>
-      <w:tr>
-        <w:tc>
-          <w:tcPr>
-            <w:tcW w:type="dxa" w:w="2074"/>
+            <w:tcW w:type="dxa" w:w="2198"/>
             <w:tcMar>
               <w:top w:type="dxa" w:w="60"/>
               <w:left w:type="dxa" w:w="100"/>
@@ -1528,7 +1427,7 @@
         </w:tc>
         <w:tc>
           <w:tcPr>
-            <w:tcW w:type="dxa" w:w="4643"/>
+            <w:tcW w:type="dxa" w:w="4523"/>
             <w:tcMar>
               <w:top w:type="dxa" w:w="60"/>
               <w:left w:type="dxa" w:w="100"/>
@@ -1553,7 +1452,7 @@
         </w:tc>
         <w:tc>
           <w:tcPr>
-            <w:tcW w:type="dxa" w:w="2303"/>
+            <w:tcW w:type="dxa" w:w="2299"/>
             <w:tcMar>
               <w:top w:type="dxa" w:w="60"/>
               <w:left w:type="dxa" w:w="100"/>
@@ -1585,7 +1484,7 @@
       <w:tr>
         <w:tc>
           <w:tcPr>
-            <w:tcW w:type="dxa" w:w="2074"/>
+            <w:tcW w:type="dxa" w:w="2198"/>
             <w:tcMar>
               <w:top w:type="dxa" w:w="60"/>
               <w:left w:type="dxa" w:w="100"/>
@@ -1610,7 +1509,7 @@
         </w:tc>
         <w:tc>
           <w:tcPr>
-            <w:tcW w:type="dxa" w:w="4643"/>
+            <w:tcW w:type="dxa" w:w="4523"/>
             <w:tcMar>
               <w:top w:type="dxa" w:w="60"/>
               <w:left w:type="dxa" w:w="100"/>
@@ -1635,7 +1534,7 @@
         </w:tc>
         <w:tc>
           <w:tcPr>
-            <w:tcW w:type="dxa" w:w="2303"/>
+            <w:tcW w:type="dxa" w:w="2299"/>
             <w:tcMar>
               <w:top w:type="dxa" w:w="60"/>
               <w:left w:type="dxa" w:w="100"/>
@@ -1681,7 +1580,7 @@
       <w:tr>
         <w:tc>
           <w:tcPr>
-            <w:tcW w:type="dxa" w:w="2074"/>
+            <w:tcW w:type="dxa" w:w="2198"/>
             <w:tcMar>
               <w:top w:type="dxa" w:w="60"/>
               <w:left w:type="dxa" w:w="100"/>
@@ -1706,7 +1605,7 @@
         </w:tc>
         <w:tc>
           <w:tcPr>
-            <w:tcW w:type="dxa" w:w="4643"/>
+            <w:tcW w:type="dxa" w:w="4523"/>
             <w:tcMar>
               <w:top w:type="dxa" w:w="60"/>
               <w:left w:type="dxa" w:w="100"/>
@@ -1731,7 +1630,7 @@
         </w:tc>
         <w:tc>
           <w:tcPr>
-            <w:tcW w:type="dxa" w:w="2303"/>
+            <w:tcW w:type="dxa" w:w="2299"/>
             <w:tcMar>
               <w:top w:type="dxa" w:w="60"/>
               <w:left w:type="dxa" w:w="100"/>
@@ -1763,7 +1662,7 @@
       <w:tr>
         <w:tc>
           <w:tcPr>
-            <w:tcW w:type="dxa" w:w="2074"/>
+            <w:tcW w:type="dxa" w:w="2198"/>
             <w:tcMar>
               <w:top w:type="dxa" w:w="60"/>
               <w:left w:type="dxa" w:w="100"/>
@@ -1788,7 +1687,7 @@
         </w:tc>
         <w:tc>
           <w:tcPr>
-            <w:tcW w:type="dxa" w:w="4643"/>
+            <w:tcW w:type="dxa" w:w="4523"/>
             <w:tcMar>
               <w:top w:type="dxa" w:w="60"/>
               <w:left w:type="dxa" w:w="100"/>
@@ -1813,7 +1712,7 @@
         </w:tc>
         <w:tc>
           <w:tcPr>
-            <w:tcW w:type="dxa" w:w="2303"/>
+            <w:tcW w:type="dxa" w:w="2299"/>
             <w:tcMar>
               <w:top w:type="dxa" w:w="60"/>
               <w:left w:type="dxa" w:w="100"/>
@@ -1845,7 +1744,7 @@
       <w:tr>
         <w:tc>
           <w:tcPr>
-            <w:tcW w:type="dxa" w:w="2074"/>
+            <w:tcW w:type="dxa" w:w="2198"/>
             <w:tcMar>
               <w:top w:type="dxa" w:w="60"/>
               <w:left w:type="dxa" w:w="100"/>
@@ -1870,7 +1769,7 @@
         </w:tc>
         <w:tc>
           <w:tcPr>
-            <w:tcW w:type="dxa" w:w="4643"/>
+            <w:tcW w:type="dxa" w:w="4523"/>
             <w:tcMar>
               <w:top w:type="dxa" w:w="60"/>
               <w:left w:type="dxa" w:w="100"/>
@@ -1895,7 +1794,7 @@
         </w:tc>
         <w:tc>
           <w:tcPr>
-            <w:tcW w:type="dxa" w:w="2303"/>
+            <w:tcW w:type="dxa" w:w="2299"/>
             <w:tcMar>
               <w:top w:type="dxa" w:w="60"/>
               <w:left w:type="dxa" w:w="100"/>
@@ -1927,7 +1826,7 @@
       <w:tr>
         <w:tc>
           <w:tcPr>
-            <w:tcW w:type="dxa" w:w="2074"/>
+            <w:tcW w:type="dxa" w:w="2198"/>
             <w:tcMar>
               <w:top w:type="dxa" w:w="60"/>
               <w:left w:type="dxa" w:w="100"/>
@@ -1952,7 +1851,7 @@
         </w:tc>
         <w:tc>
           <w:tcPr>
-            <w:tcW w:type="dxa" w:w="4643"/>
+            <w:tcW w:type="dxa" w:w="4523"/>
             <w:tcMar>
               <w:top w:type="dxa" w:w="60"/>
               <w:left w:type="dxa" w:w="100"/>
@@ -1977,7 +1876,7 @@
         </w:tc>
         <w:tc>
           <w:tcPr>
-            <w:tcW w:type="dxa" w:w="2303"/>
+            <w:tcW w:type="dxa" w:w="2299"/>
             <w:tcMar>
               <w:top w:type="dxa" w:w="60"/>
               <w:left w:type="dxa" w:w="100"/>
@@ -5217,7 +5116,7 @@
           <w:i w:val="false"/>
           <w:iCs w:val="false"/>
         </w:rPr>
-        <w:t xml:space="preserve"> NRB leads communication with its own staff, with the registration and ordering offices and with the public, and decides when live production is announced. Inkript provides the content and briefings NRB needs, and takes part in stakeholder engagement when asked, under GCC 9.13. Inkript keeps NRB management and the NRIS team informed through the project bodies in </w:t>
+        <w:t xml:space="preserve"> NRB leads communication with its own staff, with the registration and ordering offices and with the public, and decides when live production is announced. The Supplier provides the content and briefings NRB needs, and takes part in stakeholder engagement when asked, under GCC 9.13. The Supplier keeps NRB management and the NRIS team informed through the project bodies in </w:t>
       </w:r>
       <w:r>
         <w:rPr>
@@ -8082,10 +7981,10 @@
         </w:tblBorders>
       </w:tblPr>
       <w:tblGrid>
-        <w:gridCol w:w="2634"/>
+        <w:gridCol w:w="2629"/>
         <w:gridCol w:w="1450"/>
-        <w:gridCol w:w="3597"/>
-        <w:gridCol w:w="1339"/>
+        <w:gridCol w:w="3600"/>
+        <w:gridCol w:w="1341"/>
       </w:tblGrid>
       <w:tr>
         <w:trPr>
@@ -8093,7 +7992,7 @@
         </w:trPr>
         <w:tc>
           <w:tcPr>
-            <w:tcW w:type="dxa" w:w="2634"/>
+            <w:tcW w:type="dxa" w:w="2629"/>
             <w:shd w:fill="EDEDED" w:val="clear"/>
             <w:tcMar>
               <w:top w:type="dxa" w:w="60"/>
@@ -8145,7 +8044,7 @@
         </w:tc>
         <w:tc>
           <w:tcPr>
-            <w:tcW w:type="dxa" w:w="3597"/>
+            <w:tcW w:type="dxa" w:w="3600"/>
             <w:shd w:fill="EDEDED" w:val="clear"/>
             <w:tcMar>
               <w:top w:type="dxa" w:w="60"/>
@@ -8171,7 +8070,7 @@
         </w:tc>
         <w:tc>
           <w:tcPr>
-            <w:tcW w:type="dxa" w:w="1339"/>
+            <w:tcW w:type="dxa" w:w="1341"/>
             <w:shd w:fill="EDEDED" w:val="clear"/>
             <w:tcMar>
               <w:top w:type="dxa" w:w="60"/>
@@ -8199,7 +8098,7 @@
       <w:tr>
         <w:tc>
           <w:tcPr>
-            <w:tcW w:type="dxa" w:w="2634"/>
+            <w:tcW w:type="dxa" w:w="2629"/>
             <w:tcMar>
               <w:top w:type="dxa" w:w="60"/>
               <w:left w:type="dxa" w:w="100"/>
@@ -8258,7 +8157,7 @@
         </w:tc>
         <w:tc>
           <w:tcPr>
-            <w:tcW w:type="dxa" w:w="3597"/>
+            <w:tcW w:type="dxa" w:w="3600"/>
             <w:tcMar>
               <w:top w:type="dxa" w:w="60"/>
               <w:left w:type="dxa" w:w="100"/>
@@ -8283,26 +8182,26 @@
         </w:tc>
         <w:tc>
           <w:tcPr>
-            <w:tcW w:type="dxa" w:w="1339"/>
-            <w:tcMar>
-              <w:top w:type="dxa" w:w="60"/>
-              <w:left w:type="dxa" w:w="100"/>
-              <w:bottom w:type="dxa" w:w="60"/>
-              <w:right w:type="dxa" w:w="100"/>
-            </w:tcMar>
-          </w:tcPr>
-          <w:p>
-            <w:pPr>
-              <w:spacing w:after="0" w:before="0"/>
-            </w:pPr>
-            <w:r>
-              <w:rPr>
-                <w:b w:val="false"/>
-                <w:bCs w:val="false"/>
-                <w:i w:val="false"/>
-                <w:iCs w:val="false"/>
-              </w:rPr>
-              <w:t xml:space="preserve">NRB, with Inkript</w:t>
+            <w:tcW w:type="dxa" w:w="1341"/>
+            <w:tcMar>
+              <w:top w:type="dxa" w:w="60"/>
+              <w:left w:type="dxa" w:w="100"/>
+              <w:bottom w:type="dxa" w:w="60"/>
+              <w:right w:type="dxa" w:w="100"/>
+            </w:tcMar>
+          </w:tcPr>
+          <w:p>
+            <w:pPr>
+              <w:spacing w:after="0" w:before="0"/>
+            </w:pPr>
+            <w:r>
+              <w:rPr>
+                <w:b w:val="false"/>
+                <w:bCs w:val="false"/>
+                <w:i w:val="false"/>
+                <w:iCs w:val="false"/>
+              </w:rPr>
+              <w:t xml:space="preserve">NRB, with the Supplier</w:t>
             </w:r>
           </w:p>
         </w:tc>
@@ -8310,7 +8209,7 @@
       <w:tr>
         <w:tc>
           <w:tcPr>
-            <w:tcW w:type="dxa" w:w="2634"/>
+            <w:tcW w:type="dxa" w:w="2629"/>
             <w:tcMar>
               <w:top w:type="dxa" w:w="60"/>
               <w:left w:type="dxa" w:w="100"/>
@@ -8369,7 +8268,7 @@
         </w:tc>
         <w:tc>
           <w:tcPr>
-            <w:tcW w:type="dxa" w:w="3597"/>
+            <w:tcW w:type="dxa" w:w="3600"/>
             <w:tcMar>
               <w:top w:type="dxa" w:w="60"/>
               <w:left w:type="dxa" w:w="100"/>
@@ -8394,26 +8293,26 @@
         </w:tc>
         <w:tc>
           <w:tcPr>
-            <w:tcW w:type="dxa" w:w="1339"/>
-            <w:tcMar>
-              <w:top w:type="dxa" w:w="60"/>
-              <w:left w:type="dxa" w:w="100"/>
-              <w:bottom w:type="dxa" w:w="60"/>
-              <w:right w:type="dxa" w:w="100"/>
-            </w:tcMar>
-          </w:tcPr>
-          <w:p>
-            <w:pPr>
-              <w:spacing w:after="0" w:before="0"/>
-            </w:pPr>
-            <w:r>
-              <w:rPr>
-                <w:b w:val="false"/>
-                <w:bCs w:val="false"/>
-                <w:i w:val="false"/>
-                <w:iCs w:val="false"/>
-              </w:rPr>
-              <w:t xml:space="preserve">NRB, with Inkript</w:t>
+            <w:tcW w:type="dxa" w:w="1341"/>
+            <w:tcMar>
+              <w:top w:type="dxa" w:w="60"/>
+              <w:left w:type="dxa" w:w="100"/>
+              <w:bottom w:type="dxa" w:w="60"/>
+              <w:right w:type="dxa" w:w="100"/>
+            </w:tcMar>
+          </w:tcPr>
+          <w:p>
+            <w:pPr>
+              <w:spacing w:after="0" w:before="0"/>
+            </w:pPr>
+            <w:r>
+              <w:rPr>
+                <w:b w:val="false"/>
+                <w:bCs w:val="false"/>
+                <w:i w:val="false"/>
+                <w:iCs w:val="false"/>
+              </w:rPr>
+              <w:t xml:space="preserve">NRB, with the Supplier</w:t>
             </w:r>
           </w:p>
         </w:tc>
@@ -8421,7 +8320,7 @@
       <w:tr>
         <w:tc>
           <w:tcPr>
-            <w:tcW w:type="dxa" w:w="2634"/>
+            <w:tcW w:type="dxa" w:w="2629"/>
             <w:tcMar>
               <w:top w:type="dxa" w:w="60"/>
               <w:left w:type="dxa" w:w="100"/>
@@ -8480,7 +8379,7 @@
         </w:tc>
         <w:tc>
           <w:tcPr>
-            <w:tcW w:type="dxa" w:w="3597"/>
+            <w:tcW w:type="dxa" w:w="3600"/>
             <w:tcMar>
               <w:top w:type="dxa" w:w="60"/>
               <w:left w:type="dxa" w:w="100"/>
@@ -8505,26 +8404,26 @@
         </w:tc>
         <w:tc>
           <w:tcPr>
-            <w:tcW w:type="dxa" w:w="1339"/>
-            <w:tcMar>
-              <w:top w:type="dxa" w:w="60"/>
-              <w:left w:type="dxa" w:w="100"/>
-              <w:bottom w:type="dxa" w:w="60"/>
-              <w:right w:type="dxa" w:w="100"/>
-            </w:tcMar>
-          </w:tcPr>
-          <w:p>
-            <w:pPr>
-              <w:spacing w:after="0" w:before="0"/>
-            </w:pPr>
-            <w:r>
-              <w:rPr>
-                <w:b w:val="false"/>
-                <w:bCs w:val="false"/>
-                <w:i w:val="false"/>
-                <w:iCs w:val="false"/>
-              </w:rPr>
-              <w:t xml:space="preserve">NRB operations manager, with Inkript</w:t>
+            <w:tcW w:type="dxa" w:w="1341"/>
+            <w:tcMar>
+              <w:top w:type="dxa" w:w="60"/>
+              <w:left w:type="dxa" w:w="100"/>
+              <w:bottom w:type="dxa" w:w="60"/>
+              <w:right w:type="dxa" w:w="100"/>
+            </w:tcMar>
+          </w:tcPr>
+          <w:p>
+            <w:pPr>
+              <w:spacing w:after="0" w:before="0"/>
+            </w:pPr>
+            <w:r>
+              <w:rPr>
+                <w:b w:val="false"/>
+                <w:bCs w:val="false"/>
+                <w:i w:val="false"/>
+                <w:iCs w:val="false"/>
+              </w:rPr>
+              <w:t xml:space="preserve">NRB operations manager, with the Supplier</w:t>
             </w:r>
           </w:p>
         </w:tc>
@@ -8532,7 +8431,7 @@
       <w:tr>
         <w:tc>
           <w:tcPr>
-            <w:tcW w:type="dxa" w:w="2634"/>
+            <w:tcW w:type="dxa" w:w="2629"/>
             <w:tcMar>
               <w:top w:type="dxa" w:w="60"/>
               <w:left w:type="dxa" w:w="100"/>
@@ -8591,7 +8490,7 @@
         </w:tc>
         <w:tc>
           <w:tcPr>
-            <w:tcW w:type="dxa" w:w="3597"/>
+            <w:tcW w:type="dxa" w:w="3600"/>
             <w:tcMar>
               <w:top w:type="dxa" w:w="60"/>
               <w:left w:type="dxa" w:w="100"/>
@@ -8639,7 +8538,7 @@
         </w:tc>
         <w:tc>
           <w:tcPr>
-            <w:tcW w:type="dxa" w:w="1339"/>
+            <w:tcW w:type="dxa" w:w="1341"/>
             <w:tcMar>
               <w:top w:type="dxa" w:w="60"/>
               <w:left w:type="dxa" w:w="100"/>
@@ -11295,7 +11194,7 @@
           <w:i w:val="false"/>
           <w:iCs w:val="false"/>
         </w:rPr>
-        <w:t xml:space="preserve">Inkript confirms that, if awarded the Contract, it will:</w:t>
+        <w:t xml:space="preserve">The Proposer confirms that, if awarded the Contract, it will:</w:t>
       </w:r>
     </w:p>
     <w:p>
@@ -12376,413 +12275,6 @@
                 <w:t xml:space="preserve">5.3</w:t>
               </w:r>
             </w:fldSimple>
-          </w:p>
-        </w:tc>
-      </w:tr>
-    </w:tbl>
-    <w:p>
-      <w:pPr>
-        <w:spacing w:after="140"/>
-      </w:pPr>
-    </w:p>
-    <w:p>
-      <w:pPr>
-        <w:pStyle w:val="Heading2"/>
-        <w:numPr>
-          <w:ilvl w:val="1"/>
-          <w:numId w:val="2"/>
-        </w:numPr>
-        <w:spacing w:after="140" w:before="260"/>
-      </w:pPr>
-      <w:r>
-        <w:t xml:space="preserve">E</w:t>
-      </w:r>
-      <w:bookmarkStart w:name="sec_7_3" w:id="1"/>
-      <w:r>
-        <w:rPr>
-          <w:b w:val="false"/>
-          <w:bCs w:val="false"/>
-          <w:i w:val="false"/>
-          <w:iCs w:val="false"/>
-        </w:rPr>
-        <w:t xml:space="preserve">vidence of past implementation</w:t>
-      </w:r>
-      <w:bookmarkEnd w:id="1"/>
-    </w:p>
-    <w:p>
-      <w:pPr>
-        <w:spacing w:after="140" w:line="276"/>
-      </w:pPr>
-      <w:r>
-        <w:rPr>
-          <w:b/>
-          <w:bCs/>
-          <w:i w:val="false"/>
-          <w:iCs w:val="false"/>
-        </w:rPr>
-        <w:t xml:space="preserve">Attached to the Technical Proposal.</w:t>
-      </w:r>
-      <w:r>
-        <w:rPr>
-          <w:b w:val="false"/>
-          <w:bCs w:val="false"/>
-          <w:i w:val="false"/>
-          <w:iCs w:val="false"/>
-        </w:rPr>
-        <w:t xml:space="preserve"> The CV and certificates of the Training and Change Management Specialist.</w:t>
-      </w:r>
-    </w:p>
-    <w:p>
-      <w:pPr>
-        <w:spacing w:after="140" w:line="276"/>
-      </w:pPr>
-      <w:r>
-        <w:rPr>
-          <w:b/>
-          <w:bCs/>
-          <w:i w:val="false"/>
-          <w:iCs w:val="false"/>
-        </w:rPr>
-        <w:t xml:space="preserve">Past implementation.</w:t>
-      </w:r>
-      <w:r>
-        <w:rPr>
-          <w:b w:val="false"/>
-          <w:bCs w:val="false"/>
-          <w:i w:val="false"/>
-          <w:iCs w:val="false"/>
-        </w:rPr>
-        <w:t xml:space="preserve"> [Inkript to complete with two or three references and attach the client letters, described by their transition and change scope.]</w:t>
-      </w:r>
-    </w:p>
-    <w:tbl>
-      <w:tblPr>
-        <w:tblW w:type="dxa" w:w="9020"/>
-        <w:tblBorders>
-          <w:top w:val="single" w:color="auto" w:sz="4"/>
-          <w:left w:val="single" w:color="auto" w:sz="4"/>
-          <w:bottom w:val="single" w:color="auto" w:sz="4"/>
-          <w:right w:val="single" w:color="auto" w:sz="4"/>
-          <w:insideH w:val="single" w:color="auto" w:sz="4"/>
-          <w:insideV w:val="single" w:color="auto" w:sz="4"/>
-        </w:tblBorders>
-      </w:tblPr>
-      <w:tblGrid>
-        <w:gridCol w:w="2015"/>
-        <w:gridCol w:w="5884"/>
-        <w:gridCol w:w="1121"/>
-      </w:tblGrid>
-      <w:tr>
-        <w:trPr>
-          <w:tblHeader/>
-        </w:trPr>
-        <w:tc>
-          <w:tcPr>
-            <w:tcW w:type="dxa" w:w="2015"/>
-            <w:shd w:fill="EDEDED" w:val="clear"/>
-            <w:tcMar>
-              <w:top w:type="dxa" w:w="60"/>
-              <w:left w:type="dxa" w:w="100"/>
-              <w:bottom w:type="dxa" w:w="60"/>
-              <w:right w:type="dxa" w:w="100"/>
-            </w:tcMar>
-          </w:tcPr>
-          <w:p>
-            <w:pPr>
-              <w:spacing w:after="0" w:before="0"/>
-            </w:pPr>
-            <w:r>
-              <w:rPr>
-                <w:b/>
-                <w:bCs/>
-                <w:i w:val="false"/>
-                <w:iCs w:val="false"/>
-              </w:rPr>
-              <w:t xml:space="preserve">Project, client, country and period</w:t>
-            </w:r>
-          </w:p>
-        </w:tc>
-        <w:tc>
-          <w:tcPr>
-            <w:tcW w:type="dxa" w:w="5884"/>
-            <w:shd w:fill="EDEDED" w:val="clear"/>
-            <w:tcMar>
-              <w:top w:type="dxa" w:w="60"/>
-              <w:left w:type="dxa" w:w="100"/>
-              <w:bottom w:type="dxa" w:w="60"/>
-              <w:right w:type="dxa" w:w="100"/>
-            </w:tcMar>
-          </w:tcPr>
-          <w:p>
-            <w:pPr>
-              <w:spacing w:after="0" w:before="0"/>
-            </w:pPr>
-            <w:r>
-              <w:rPr>
-                <w:b/>
-                <w:bCs/>
-                <w:i w:val="false"/>
-                <w:iCs w:val="false"/>
-              </w:rPr>
-              <w:t xml:space="preserve">Transition and change scope comparable to this Contract</w:t>
-            </w:r>
-          </w:p>
-        </w:tc>
-        <w:tc>
-          <w:tcPr>
-            <w:tcW w:type="dxa" w:w="1121"/>
-            <w:shd w:fill="EDEDED" w:val="clear"/>
-            <w:tcMar>
-              <w:top w:type="dxa" w:w="60"/>
-              <w:left w:type="dxa" w:w="100"/>
-              <w:bottom w:type="dxa" w:w="60"/>
-              <w:right w:type="dxa" w:w="100"/>
-            </w:tcMar>
-          </w:tcPr>
-          <w:p>
-            <w:pPr>
-              <w:spacing w:after="0" w:before="0"/>
-            </w:pPr>
-            <w:r>
-              <w:rPr>
-                <w:b/>
-                <w:bCs/>
-                <w:i w:val="false"/>
-                <w:iCs w:val="false"/>
-              </w:rPr>
-              <w:t xml:space="preserve">Evidence attached</w:t>
-            </w:r>
-          </w:p>
-        </w:tc>
-      </w:tr>
-      <w:tr>
-        <w:tc>
-          <w:tcPr>
-            <w:tcW w:type="dxa" w:w="2015"/>
-            <w:tcMar>
-              <w:top w:type="dxa" w:w="60"/>
-              <w:left w:type="dxa" w:w="100"/>
-              <w:bottom w:type="dxa" w:w="60"/>
-              <w:right w:type="dxa" w:w="100"/>
-            </w:tcMar>
-          </w:tcPr>
-          <w:p>
-            <w:pPr>
-              <w:spacing w:after="0" w:before="0"/>
-            </w:pPr>
-            <w:r>
-              <w:rPr>
-                <w:b w:val="false"/>
-                <w:bCs w:val="false"/>
-                <w:i w:val="false"/>
-                <w:iCs w:val="false"/>
-              </w:rPr>
-              <w:t xml:space="preserve">[Reference 1]</w:t>
-            </w:r>
-          </w:p>
-        </w:tc>
-        <w:tc>
-          <w:tcPr>
-            <w:tcW w:type="dxa" w:w="5884"/>
-            <w:tcMar>
-              <w:top w:type="dxa" w:w="60"/>
-              <w:left w:type="dxa" w:w="100"/>
-              <w:bottom w:type="dxa" w:w="60"/>
-              <w:right w:type="dxa" w:w="100"/>
-            </w:tcMar>
-          </w:tcPr>
-          <w:p>
-            <w:pPr>
-              <w:spacing w:after="0" w:before="0"/>
-            </w:pPr>
-            <w:r>
-              <w:rPr>
-                <w:b w:val="false"/>
-                <w:bCs w:val="false"/>
-                <w:i w:val="false"/>
-                <w:iCs w:val="false"/>
-              </w:rPr>
-              <w:t xml:space="preserve">[For example: cutover from a legacy issuance process, operator and administrator training, handover of operation to a government agency, change control in operation]</w:t>
-            </w:r>
-          </w:p>
-        </w:tc>
-        <w:tc>
-          <w:tcPr>
-            <w:tcW w:type="dxa" w:w="1121"/>
-            <w:tcMar>
-              <w:top w:type="dxa" w:w="60"/>
-              <w:left w:type="dxa" w:w="100"/>
-              <w:bottom w:type="dxa" w:w="60"/>
-              <w:right w:type="dxa" w:w="100"/>
-            </w:tcMar>
-          </w:tcPr>
-          <w:p>
-            <w:pPr>
-              <w:spacing w:after="0" w:before="0"/>
-            </w:pPr>
-            <w:r>
-              <w:rPr>
-                <w:b w:val="false"/>
-                <w:bCs w:val="false"/>
-                <w:i w:val="false"/>
-                <w:iCs w:val="false"/>
-              </w:rPr>
-              <w:t xml:space="preserve">[Client letter]</w:t>
-            </w:r>
-          </w:p>
-        </w:tc>
-      </w:tr>
-      <w:tr>
-        <w:tc>
-          <w:tcPr>
-            <w:tcW w:type="dxa" w:w="2015"/>
-            <w:tcMar>
-              <w:top w:type="dxa" w:w="60"/>
-              <w:left w:type="dxa" w:w="100"/>
-              <w:bottom w:type="dxa" w:w="60"/>
-              <w:right w:type="dxa" w:w="100"/>
-            </w:tcMar>
-          </w:tcPr>
-          <w:p>
-            <w:pPr>
-              <w:spacing w:after="0" w:before="0"/>
-            </w:pPr>
-            <w:r>
-              <w:rPr>
-                <w:b w:val="false"/>
-                <w:bCs w:val="false"/>
-                <w:i w:val="false"/>
-                <w:iCs w:val="false"/>
-              </w:rPr>
-              <w:t xml:space="preserve">[Reference 2]</w:t>
-            </w:r>
-          </w:p>
-        </w:tc>
-        <w:tc>
-          <w:tcPr>
-            <w:tcW w:type="dxa" w:w="5884"/>
-            <w:tcMar>
-              <w:top w:type="dxa" w:w="60"/>
-              <w:left w:type="dxa" w:w="100"/>
-              <w:bottom w:type="dxa" w:w="60"/>
-              <w:right w:type="dxa" w:w="100"/>
-            </w:tcMar>
-          </w:tcPr>
-          <w:p>
-            <w:pPr>
-              <w:spacing w:after="0" w:before="0"/>
-            </w:pPr>
-            <w:r>
-              <w:rPr>
-                <w:b w:val="false"/>
-                <w:bCs w:val="false"/>
-                <w:i w:val="false"/>
-                <w:iCs w:val="false"/>
-              </w:rPr>
-              <w:t xml:space="preserve"/>
-            </w:r>
-          </w:p>
-        </w:tc>
-        <w:tc>
-          <w:tcPr>
-            <w:tcW w:type="dxa" w:w="1121"/>
-            <w:tcMar>
-              <w:top w:type="dxa" w:w="60"/>
-              <w:left w:type="dxa" w:w="100"/>
-              <w:bottom w:type="dxa" w:w="60"/>
-              <w:right w:type="dxa" w:w="100"/>
-            </w:tcMar>
-          </w:tcPr>
-          <w:p>
-            <w:pPr>
-              <w:spacing w:after="0" w:before="0"/>
-            </w:pPr>
-            <w:r>
-              <w:rPr>
-                <w:b w:val="false"/>
-                <w:bCs w:val="false"/>
-                <w:i w:val="false"/>
-                <w:iCs w:val="false"/>
-              </w:rPr>
-              <w:t xml:space="preserve"/>
-            </w:r>
-          </w:p>
-        </w:tc>
-      </w:tr>
-      <w:tr>
-        <w:tc>
-          <w:tcPr>
-            <w:tcW w:type="dxa" w:w="2015"/>
-            <w:tcMar>
-              <w:top w:type="dxa" w:w="60"/>
-              <w:left w:type="dxa" w:w="100"/>
-              <w:bottom w:type="dxa" w:w="60"/>
-              <w:right w:type="dxa" w:w="100"/>
-            </w:tcMar>
-          </w:tcPr>
-          <w:p>
-            <w:pPr>
-              <w:spacing w:after="0" w:before="0"/>
-            </w:pPr>
-            <w:r>
-              <w:rPr>
-                <w:b w:val="false"/>
-                <w:bCs w:val="false"/>
-                <w:i w:val="false"/>
-                <w:iCs w:val="false"/>
-              </w:rPr>
-              <w:t xml:space="preserve">[Reference 3]</w:t>
-            </w:r>
-          </w:p>
-        </w:tc>
-        <w:tc>
-          <w:tcPr>
-            <w:tcW w:type="dxa" w:w="5884"/>
-            <w:tcMar>
-              <w:top w:type="dxa" w:w="60"/>
-              <w:left w:type="dxa" w:w="100"/>
-              <w:bottom w:type="dxa" w:w="60"/>
-              <w:right w:type="dxa" w:w="100"/>
-            </w:tcMar>
-          </w:tcPr>
-          <w:p>
-            <w:pPr>
-              <w:spacing w:after="0" w:before="0"/>
-            </w:pPr>
-            <w:r>
-              <w:rPr>
-                <w:b w:val="false"/>
-                <w:bCs w:val="false"/>
-                <w:i w:val="false"/>
-                <w:iCs w:val="false"/>
-              </w:rPr>
-              <w:t xml:space="preserve"/>
-            </w:r>
-          </w:p>
-        </w:tc>
-        <w:tc>
-          <w:tcPr>
-            <w:tcW w:type="dxa" w:w="1121"/>
-            <w:tcMar>
-              <w:top w:type="dxa" w:w="60"/>
-              <w:left w:type="dxa" w:w="100"/>
-              <w:bottom w:type="dxa" w:w="60"/>
-              <w:right w:type="dxa" w:w="100"/>
-            </w:tcMar>
-          </w:tcPr>
-          <w:p>
-            <w:pPr>
-              <w:spacing w:after="0" w:before="0"/>
-            </w:pPr>
-            <w:r>
-              <w:rPr>
-                <w:b w:val="false"/>
-                <w:bCs w:val="false"/>
-                <w:i w:val="false"/>
-                <w:iCs w:val="false"/>
-              </w:rPr>
-              <w:t xml:space="preserve"/>
-            </w:r>
           </w:p>
         </w:tc>
       </w:tr>

</xml_diff>